<commit_message>
WORKING ON SET 5
-"Solution"
</commit_message>
<xml_diff>
--- a/Set_5/FindTraversals-TestCases.docx
+++ b/Set_5/FindTraversals-TestCases.docx
@@ -7,13 +7,61 @@
         <w:t xml:space="preserve">Sample: </w:t>
       </w:r>
     </w:p>
+    <w:p>
+      <w:r>
+        <w:t xml:space="preserve">Pre-Order: </w:t>
+      </w:r>
+      <w:r>
+        <w:t>HDXBJEKSFTG</w:t>
+      </w:r>
+    </w:p>
+    <w:p>
+      <w:r>
+        <w:t xml:space="preserve">In-Order: </w:t>
+      </w:r>
+      <w:r>
+        <w:t>SBDHXEJKTFG</w:t>
+      </w:r>
+    </w:p>
     <w:p/>
     <w:p>
       <w:r>
-        <w:t>Custom:</w:t>
+        <w:t xml:space="preserve">Post-Order: </w:t>
+      </w:r>
+      <w:r>
+        <w:t>ACBFGED</w:t>
+      </w:r>
+    </w:p>
+    <w:p>
+      <w:r>
+        <w:t xml:space="preserve">In-Order: </w:t>
+      </w:r>
+      <w:r>
+        <w:t>ABCDEFG</w:t>
       </w:r>
     </w:p>
     <w:p/>
+    <w:p>
+      <w:r>
+        <w:t>Custom:</w:t>
+      </w:r>
+    </w:p>
+    <w:p>
+      <w:r>
+        <w:t xml:space="preserve">Pre-Order: </w:t>
+      </w:r>
+      <w:r>
+        <w:t>ZYXWVUT</w:t>
+      </w:r>
+    </w:p>
+    <w:p>
+      <w:r>
+        <w:t xml:space="preserve">Post-Order: </w:t>
+      </w:r>
+      <w:r>
+        <w:t>WVYZUTX</w:t>
+      </w:r>
+    </w:p>
     <w:sectPr>
       <w:pgSz w:w="12240" w:h="15840"/>
       <w:pgMar w:top="1440" w:right="1800" w:bottom="1440" w:left="1800" w:header="720" w:footer="720" w:gutter="0"/>
@@ -627,7 +675,6 @@
   <w:style w:type="character" w:default="1" w:styleId="DefaultParagraphFont">
     <w:name w:val="Default Paragraph Font"/>
     <w:uiPriority w:val="1"/>
-    <w:semiHidden/>
     <w:unhideWhenUsed/>
   </w:style>
   <w:style w:type="table" w:default="1" w:styleId="TableNormal">

</xml_diff>